<commit_message>
revisii lembar bimbingan mentor
</commit_message>
<xml_diff>
--- a/aktualisasi/KARTU BIMBINGAN MENTOR.docx
+++ b/aktualisasi/KARTU BIMBINGAN MENTOR.docx
@@ -433,34 +433,14 @@
                 <w:szCs w:val="24"/>
               </w:rPr>
             </w:pPr>
-            <w:proofErr w:type="spellStart"/>
-            <w:r>
-              <w:rPr>
-                <w:rFonts w:ascii="Arial" w:hAnsi="Arial" w:cs="Arial"/>
-                <w:sz w:val="24"/>
-                <w:szCs w:val="24"/>
-              </w:rPr>
-              <w:t>Penyelesaian</w:t>
-            </w:r>
-            <w:proofErr w:type="spellEnd"/>
-            <w:r>
-              <w:rPr>
-                <w:rFonts w:ascii="Arial" w:hAnsi="Arial" w:cs="Arial"/>
-                <w:sz w:val="24"/>
-                <w:szCs w:val="24"/>
-              </w:rPr>
-              <w:t xml:space="preserve"> </w:t>
-            </w:r>
-            <w:proofErr w:type="spellStart"/>
-            <w:r>
-              <w:rPr>
-                <w:rFonts w:ascii="Arial" w:hAnsi="Arial" w:cs="Arial"/>
-                <w:sz w:val="24"/>
-                <w:szCs w:val="24"/>
-              </w:rPr>
-              <w:t>Kegiatan</w:t>
-            </w:r>
-            <w:proofErr w:type="spellEnd"/>
+            <w:r>
+              <w:rPr>
+                <w:rFonts w:ascii="Arial" w:hAnsi="Arial" w:cs="Arial"/>
+                <w:sz w:val="24"/>
+                <w:szCs w:val="24"/>
+              </w:rPr>
+              <w:t>Penyelesaian Kegiatan</w:t>
+            </w:r>
           </w:p>
         </w:tc>
         <w:tc>
@@ -477,23 +457,13 @@
                 <w:szCs w:val="24"/>
               </w:rPr>
             </w:pPr>
-            <w:proofErr w:type="spellStart"/>
-            <w:r>
-              <w:rPr>
-                <w:rFonts w:ascii="Arial" w:hAnsi="Arial" w:cs="Arial"/>
-                <w:sz w:val="24"/>
-                <w:szCs w:val="24"/>
-              </w:rPr>
-              <w:t>Catatan</w:t>
-            </w:r>
-            <w:proofErr w:type="spellEnd"/>
-            <w:r>
-              <w:rPr>
-                <w:rFonts w:ascii="Arial" w:hAnsi="Arial" w:cs="Arial"/>
-                <w:sz w:val="24"/>
-                <w:szCs w:val="24"/>
-              </w:rPr>
-              <w:t xml:space="preserve"> Mentor</w:t>
+            <w:r>
+              <w:rPr>
+                <w:rFonts w:ascii="Arial" w:hAnsi="Arial" w:cs="Arial"/>
+                <w:sz w:val="24"/>
+                <w:szCs w:val="24"/>
+              </w:rPr>
+              <w:t>Catatan Mentor</w:t>
             </w:r>
           </w:p>
         </w:tc>
@@ -543,59 +513,13 @@
                 <w:szCs w:val="24"/>
               </w:rPr>
             </w:pPr>
-            <w:proofErr w:type="spellStart"/>
-            <w:r>
-              <w:rPr>
-                <w:rFonts w:ascii="Arial" w:hAnsi="Arial" w:cs="Arial"/>
-                <w:sz w:val="24"/>
-                <w:szCs w:val="24"/>
-              </w:rPr>
-              <w:t>Tahapan</w:t>
-            </w:r>
-            <w:proofErr w:type="spellEnd"/>
-            <w:r>
-              <w:rPr>
-                <w:rFonts w:ascii="Arial" w:hAnsi="Arial" w:cs="Arial"/>
-                <w:sz w:val="24"/>
-                <w:szCs w:val="24"/>
-              </w:rPr>
-              <w:t xml:space="preserve"> </w:t>
-            </w:r>
-            <w:proofErr w:type="spellStart"/>
-            <w:r>
-              <w:rPr>
-                <w:rFonts w:ascii="Arial" w:hAnsi="Arial" w:cs="Arial"/>
-                <w:sz w:val="24"/>
-                <w:szCs w:val="24"/>
-              </w:rPr>
-              <w:t>Rancangan</w:t>
-            </w:r>
-            <w:proofErr w:type="spellEnd"/>
-            <w:r>
-              <w:rPr>
-                <w:rFonts w:ascii="Arial" w:hAnsi="Arial" w:cs="Arial"/>
-                <w:sz w:val="24"/>
-                <w:szCs w:val="24"/>
-              </w:rPr>
-              <w:t xml:space="preserve"> </w:t>
-            </w:r>
-            <w:proofErr w:type="spellStart"/>
-            <w:r>
-              <w:rPr>
-                <w:rFonts w:ascii="Arial" w:hAnsi="Arial" w:cs="Arial"/>
-                <w:sz w:val="24"/>
-                <w:szCs w:val="24"/>
-              </w:rPr>
-              <w:t>Kegiatan</w:t>
-            </w:r>
-            <w:proofErr w:type="spellEnd"/>
-            <w:r>
-              <w:rPr>
-                <w:rFonts w:ascii="Arial" w:hAnsi="Arial" w:cs="Arial"/>
-                <w:sz w:val="24"/>
-                <w:szCs w:val="24"/>
-              </w:rPr>
-              <w:t>;</w:t>
+            <w:r>
+              <w:rPr>
+                <w:rFonts w:ascii="Arial" w:hAnsi="Arial" w:cs="Arial"/>
+                <w:sz w:val="24"/>
+                <w:szCs w:val="24"/>
+              </w:rPr>
+              <w:t>Tahapan Rancangan Kegiatan;</w:t>
             </w:r>
           </w:p>
         </w:tc>
@@ -656,97 +580,7 @@
                 <w:sz w:val="24"/>
                 <w:szCs w:val="24"/>
               </w:rPr>
-              <w:t xml:space="preserve">Output </w:t>
-            </w:r>
-            <w:proofErr w:type="spellStart"/>
-            <w:r>
-              <w:rPr>
-                <w:rFonts w:ascii="Arial" w:hAnsi="Arial" w:cs="Arial"/>
-                <w:sz w:val="24"/>
-                <w:szCs w:val="24"/>
-              </w:rPr>
-              <w:t>Rancangan</w:t>
-            </w:r>
-            <w:proofErr w:type="spellEnd"/>
-            <w:r>
-              <w:rPr>
-                <w:rFonts w:ascii="Arial" w:hAnsi="Arial" w:cs="Arial"/>
-                <w:sz w:val="24"/>
-                <w:szCs w:val="24"/>
-              </w:rPr>
-              <w:t xml:space="preserve"> </w:t>
-            </w:r>
-            <w:proofErr w:type="spellStart"/>
-            <w:r>
-              <w:rPr>
-                <w:rFonts w:ascii="Arial" w:hAnsi="Arial" w:cs="Arial"/>
-                <w:sz w:val="24"/>
-                <w:szCs w:val="24"/>
-              </w:rPr>
-              <w:t>Kegiatan</w:t>
-            </w:r>
-            <w:proofErr w:type="spellEnd"/>
-            <w:r>
-              <w:rPr>
-                <w:rFonts w:ascii="Arial" w:hAnsi="Arial" w:cs="Arial"/>
-                <w:sz w:val="24"/>
-                <w:szCs w:val="24"/>
-              </w:rPr>
-              <w:t xml:space="preserve"> </w:t>
-            </w:r>
-            <w:proofErr w:type="spellStart"/>
-            <w:r>
-              <w:rPr>
-                <w:rFonts w:ascii="Arial" w:hAnsi="Arial" w:cs="Arial"/>
-                <w:sz w:val="24"/>
-                <w:szCs w:val="24"/>
-              </w:rPr>
-              <w:t>Terhadap</w:t>
-            </w:r>
-            <w:proofErr w:type="spellEnd"/>
-            <w:r>
-              <w:rPr>
-                <w:rFonts w:ascii="Arial" w:hAnsi="Arial" w:cs="Arial"/>
-                <w:sz w:val="24"/>
-                <w:szCs w:val="24"/>
-              </w:rPr>
-              <w:t xml:space="preserve"> </w:t>
-            </w:r>
-            <w:proofErr w:type="spellStart"/>
-            <w:r>
-              <w:rPr>
-                <w:rFonts w:ascii="Arial" w:hAnsi="Arial" w:cs="Arial"/>
-                <w:sz w:val="24"/>
-                <w:szCs w:val="24"/>
-              </w:rPr>
-              <w:t>Pemecahan</w:t>
-            </w:r>
-            <w:proofErr w:type="spellEnd"/>
-            <w:r>
-              <w:rPr>
-                <w:rFonts w:ascii="Arial" w:hAnsi="Arial" w:cs="Arial"/>
-                <w:sz w:val="24"/>
-                <w:szCs w:val="24"/>
-              </w:rPr>
-              <w:t xml:space="preserve"> </w:t>
-            </w:r>
-            <w:proofErr w:type="spellStart"/>
-            <w:r>
-              <w:rPr>
-                <w:rFonts w:ascii="Arial" w:hAnsi="Arial" w:cs="Arial"/>
-                <w:sz w:val="24"/>
-                <w:szCs w:val="24"/>
-              </w:rPr>
-              <w:t>Isu</w:t>
-            </w:r>
-            <w:proofErr w:type="spellEnd"/>
-            <w:r>
-              <w:rPr>
-                <w:rFonts w:ascii="Arial" w:hAnsi="Arial" w:cs="Arial"/>
-                <w:sz w:val="24"/>
-                <w:szCs w:val="24"/>
-              </w:rPr>
-              <w:t>;</w:t>
+              <w:t>Output Rancangan Kegiatan Terhadap Pemecahan Isu;</w:t>
             </w:r>
           </w:p>
         </w:tc>
@@ -801,59 +635,13 @@
                 <w:szCs w:val="24"/>
               </w:rPr>
             </w:pPr>
-            <w:proofErr w:type="spellStart"/>
-            <w:r>
-              <w:rPr>
-                <w:rFonts w:ascii="Arial" w:hAnsi="Arial" w:cs="Arial"/>
-                <w:sz w:val="24"/>
-                <w:szCs w:val="24"/>
-              </w:rPr>
-              <w:t>Keterkaitan</w:t>
-            </w:r>
-            <w:proofErr w:type="spellEnd"/>
-            <w:r>
-              <w:rPr>
-                <w:rFonts w:ascii="Arial" w:hAnsi="Arial" w:cs="Arial"/>
-                <w:sz w:val="24"/>
-                <w:szCs w:val="24"/>
-              </w:rPr>
-              <w:t xml:space="preserve"> </w:t>
-            </w:r>
-            <w:proofErr w:type="spellStart"/>
-            <w:r>
-              <w:rPr>
-                <w:rFonts w:ascii="Arial" w:hAnsi="Arial" w:cs="Arial"/>
-                <w:sz w:val="24"/>
-                <w:szCs w:val="24"/>
-              </w:rPr>
-              <w:t>Substansi</w:t>
-            </w:r>
-            <w:proofErr w:type="spellEnd"/>
-            <w:r>
-              <w:rPr>
-                <w:rFonts w:ascii="Arial" w:hAnsi="Arial" w:cs="Arial"/>
-                <w:sz w:val="24"/>
-                <w:szCs w:val="24"/>
-              </w:rPr>
-              <w:t xml:space="preserve"> Mata </w:t>
-            </w:r>
-            <w:proofErr w:type="spellStart"/>
-            <w:r>
-              <w:rPr>
-                <w:rFonts w:ascii="Arial" w:hAnsi="Arial" w:cs="Arial"/>
-                <w:sz w:val="24"/>
-                <w:szCs w:val="24"/>
-              </w:rPr>
-              <w:t>pelatihan</w:t>
-            </w:r>
-            <w:proofErr w:type="spellEnd"/>
-            <w:r>
-              <w:rPr>
-                <w:rFonts w:ascii="Arial" w:hAnsi="Arial" w:cs="Arial"/>
-                <w:sz w:val="24"/>
-                <w:szCs w:val="24"/>
-              </w:rPr>
-              <w:t>;</w:t>
+            <w:r>
+              <w:rPr>
+                <w:rFonts w:ascii="Arial" w:hAnsi="Arial" w:cs="Arial"/>
+                <w:sz w:val="24"/>
+                <w:szCs w:val="24"/>
+              </w:rPr>
+              <w:t>Keterkaitan Substansi Mata pelatihan;</w:t>
             </w:r>
           </w:p>
         </w:tc>
@@ -973,41 +761,13 @@
                 <w:lang w:val="sv-SE"/>
               </w:rPr>
             </w:pPr>
-            <w:proofErr w:type="spellStart"/>
-            <w:r>
-              <w:rPr>
-                <w:rFonts w:ascii="Arial" w:hAnsi="Arial" w:cs="Arial"/>
-                <w:sz w:val="24"/>
-                <w:szCs w:val="24"/>
-              </w:rPr>
-              <w:t>Penguatan</w:t>
-            </w:r>
-            <w:proofErr w:type="spellEnd"/>
-            <w:r>
-              <w:rPr>
-                <w:rFonts w:ascii="Arial" w:hAnsi="Arial" w:cs="Arial"/>
-                <w:sz w:val="24"/>
-                <w:szCs w:val="24"/>
-              </w:rPr>
-              <w:t xml:space="preserve"> Nilai </w:t>
-            </w:r>
-            <w:proofErr w:type="spellStart"/>
-            <w:r>
-              <w:rPr>
-                <w:rFonts w:ascii="Arial" w:hAnsi="Arial" w:cs="Arial"/>
-                <w:sz w:val="24"/>
-                <w:szCs w:val="24"/>
-              </w:rPr>
-              <w:t>Organisasi</w:t>
-            </w:r>
-            <w:proofErr w:type="spellEnd"/>
-            <w:r>
-              <w:rPr>
-                <w:rFonts w:ascii="Arial" w:hAnsi="Arial" w:cs="Arial"/>
-                <w:sz w:val="24"/>
-                <w:szCs w:val="24"/>
-              </w:rPr>
-              <w:t>;</w:t>
+            <w:r>
+              <w:rPr>
+                <w:rFonts w:ascii="Arial" w:hAnsi="Arial" w:cs="Arial"/>
+                <w:sz w:val="24"/>
+                <w:szCs w:val="24"/>
+              </w:rPr>
+              <w:t>Penguatan Nilai Organisasi;</w:t>
             </w:r>
           </w:p>
         </w:tc>
@@ -1143,34 +903,14 @@
                 <w:szCs w:val="24"/>
               </w:rPr>
             </w:pPr>
-            <w:proofErr w:type="spellStart"/>
-            <w:r>
-              <w:rPr>
-                <w:rFonts w:ascii="Arial" w:hAnsi="Arial" w:cs="Arial"/>
-                <w:sz w:val="24"/>
-                <w:szCs w:val="24"/>
-              </w:rPr>
-              <w:t>Penyelesaian</w:t>
-            </w:r>
-            <w:proofErr w:type="spellEnd"/>
-            <w:r>
-              <w:rPr>
-                <w:rFonts w:ascii="Arial" w:hAnsi="Arial" w:cs="Arial"/>
-                <w:sz w:val="24"/>
-                <w:szCs w:val="24"/>
-              </w:rPr>
-              <w:t xml:space="preserve"> </w:t>
-            </w:r>
-            <w:proofErr w:type="spellStart"/>
-            <w:r>
-              <w:rPr>
-                <w:rFonts w:ascii="Arial" w:hAnsi="Arial" w:cs="Arial"/>
-                <w:sz w:val="24"/>
-                <w:szCs w:val="24"/>
-              </w:rPr>
-              <w:t>Kegiatan</w:t>
-            </w:r>
-            <w:proofErr w:type="spellEnd"/>
+            <w:r>
+              <w:rPr>
+                <w:rFonts w:ascii="Arial" w:hAnsi="Arial" w:cs="Arial"/>
+                <w:sz w:val="24"/>
+                <w:szCs w:val="24"/>
+              </w:rPr>
+              <w:t>Penyelesaian Kegiatan</w:t>
+            </w:r>
           </w:p>
         </w:tc>
         <w:tc>
@@ -1187,23 +927,13 @@
                 <w:szCs w:val="24"/>
               </w:rPr>
             </w:pPr>
-            <w:proofErr w:type="spellStart"/>
-            <w:r>
-              <w:rPr>
-                <w:rFonts w:ascii="Arial" w:hAnsi="Arial" w:cs="Arial"/>
-                <w:sz w:val="24"/>
-                <w:szCs w:val="24"/>
-              </w:rPr>
-              <w:t>Catatan</w:t>
-            </w:r>
-            <w:proofErr w:type="spellEnd"/>
-            <w:r>
-              <w:rPr>
-                <w:rFonts w:ascii="Arial" w:hAnsi="Arial" w:cs="Arial"/>
-                <w:sz w:val="24"/>
-                <w:szCs w:val="24"/>
-              </w:rPr>
-              <w:t xml:space="preserve"> Mentor</w:t>
+            <w:r>
+              <w:rPr>
+                <w:rFonts w:ascii="Arial" w:hAnsi="Arial" w:cs="Arial"/>
+                <w:sz w:val="24"/>
+                <w:szCs w:val="24"/>
+              </w:rPr>
+              <w:t>Catatan Mentor</w:t>
             </w:r>
           </w:p>
         </w:tc>
@@ -1253,59 +983,13 @@
                 <w:szCs w:val="24"/>
               </w:rPr>
             </w:pPr>
-            <w:proofErr w:type="spellStart"/>
-            <w:r>
-              <w:rPr>
-                <w:rFonts w:ascii="Arial" w:hAnsi="Arial" w:cs="Arial"/>
-                <w:sz w:val="24"/>
-                <w:szCs w:val="24"/>
-              </w:rPr>
-              <w:t>Tahapan</w:t>
-            </w:r>
-            <w:proofErr w:type="spellEnd"/>
-            <w:r>
-              <w:rPr>
-                <w:rFonts w:ascii="Arial" w:hAnsi="Arial" w:cs="Arial"/>
-                <w:sz w:val="24"/>
-                <w:szCs w:val="24"/>
-              </w:rPr>
-              <w:t xml:space="preserve"> </w:t>
-            </w:r>
-            <w:proofErr w:type="spellStart"/>
-            <w:r>
-              <w:rPr>
-                <w:rFonts w:ascii="Arial" w:hAnsi="Arial" w:cs="Arial"/>
-                <w:sz w:val="24"/>
-                <w:szCs w:val="24"/>
-              </w:rPr>
-              <w:t>Rancangan</w:t>
-            </w:r>
-            <w:proofErr w:type="spellEnd"/>
-            <w:r>
-              <w:rPr>
-                <w:rFonts w:ascii="Arial" w:hAnsi="Arial" w:cs="Arial"/>
-                <w:sz w:val="24"/>
-                <w:szCs w:val="24"/>
-              </w:rPr>
-              <w:t xml:space="preserve"> </w:t>
-            </w:r>
-            <w:proofErr w:type="spellStart"/>
-            <w:r>
-              <w:rPr>
-                <w:rFonts w:ascii="Arial" w:hAnsi="Arial" w:cs="Arial"/>
-                <w:sz w:val="24"/>
-                <w:szCs w:val="24"/>
-              </w:rPr>
-              <w:t>Kegiatan</w:t>
-            </w:r>
-            <w:proofErr w:type="spellEnd"/>
-            <w:r>
-              <w:rPr>
-                <w:rFonts w:ascii="Arial" w:hAnsi="Arial" w:cs="Arial"/>
-                <w:sz w:val="24"/>
-                <w:szCs w:val="24"/>
-              </w:rPr>
-              <w:t>;</w:t>
+            <w:r>
+              <w:rPr>
+                <w:rFonts w:ascii="Arial" w:hAnsi="Arial" w:cs="Arial"/>
+                <w:sz w:val="24"/>
+                <w:szCs w:val="24"/>
+              </w:rPr>
+              <w:t>Tahapan Rancangan Kegiatan;</w:t>
             </w:r>
           </w:p>
         </w:tc>
@@ -1366,97 +1050,7 @@
                 <w:sz w:val="24"/>
                 <w:szCs w:val="24"/>
               </w:rPr>
-              <w:t xml:space="preserve">Output </w:t>
-            </w:r>
-            <w:proofErr w:type="spellStart"/>
-            <w:r>
-              <w:rPr>
-                <w:rFonts w:ascii="Arial" w:hAnsi="Arial" w:cs="Arial"/>
-                <w:sz w:val="24"/>
-                <w:szCs w:val="24"/>
-              </w:rPr>
-              <w:t>Rancangan</w:t>
-            </w:r>
-            <w:proofErr w:type="spellEnd"/>
-            <w:r>
-              <w:rPr>
-                <w:rFonts w:ascii="Arial" w:hAnsi="Arial" w:cs="Arial"/>
-                <w:sz w:val="24"/>
-                <w:szCs w:val="24"/>
-              </w:rPr>
-              <w:t xml:space="preserve"> </w:t>
-            </w:r>
-            <w:proofErr w:type="spellStart"/>
-            <w:r>
-              <w:rPr>
-                <w:rFonts w:ascii="Arial" w:hAnsi="Arial" w:cs="Arial"/>
-                <w:sz w:val="24"/>
-                <w:szCs w:val="24"/>
-              </w:rPr>
-              <w:t>Kegiatan</w:t>
-            </w:r>
-            <w:proofErr w:type="spellEnd"/>
-            <w:r>
-              <w:rPr>
-                <w:rFonts w:ascii="Arial" w:hAnsi="Arial" w:cs="Arial"/>
-                <w:sz w:val="24"/>
-                <w:szCs w:val="24"/>
-              </w:rPr>
-              <w:t xml:space="preserve"> </w:t>
-            </w:r>
-            <w:proofErr w:type="spellStart"/>
-            <w:r>
-              <w:rPr>
-                <w:rFonts w:ascii="Arial" w:hAnsi="Arial" w:cs="Arial"/>
-                <w:sz w:val="24"/>
-                <w:szCs w:val="24"/>
-              </w:rPr>
-              <w:t>Terhadap</w:t>
-            </w:r>
-            <w:proofErr w:type="spellEnd"/>
-            <w:r>
-              <w:rPr>
-                <w:rFonts w:ascii="Arial" w:hAnsi="Arial" w:cs="Arial"/>
-                <w:sz w:val="24"/>
-                <w:szCs w:val="24"/>
-              </w:rPr>
-              <w:t xml:space="preserve"> </w:t>
-            </w:r>
-            <w:proofErr w:type="spellStart"/>
-            <w:r>
-              <w:rPr>
-                <w:rFonts w:ascii="Arial" w:hAnsi="Arial" w:cs="Arial"/>
-                <w:sz w:val="24"/>
-                <w:szCs w:val="24"/>
-              </w:rPr>
-              <w:t>Pemecahan</w:t>
-            </w:r>
-            <w:proofErr w:type="spellEnd"/>
-            <w:r>
-              <w:rPr>
-                <w:rFonts w:ascii="Arial" w:hAnsi="Arial" w:cs="Arial"/>
-                <w:sz w:val="24"/>
-                <w:szCs w:val="24"/>
-              </w:rPr>
-              <w:t xml:space="preserve"> </w:t>
-            </w:r>
-            <w:proofErr w:type="spellStart"/>
-            <w:r>
-              <w:rPr>
-                <w:rFonts w:ascii="Arial" w:hAnsi="Arial" w:cs="Arial"/>
-                <w:sz w:val="24"/>
-                <w:szCs w:val="24"/>
-              </w:rPr>
-              <w:t>Isu</w:t>
-            </w:r>
-            <w:proofErr w:type="spellEnd"/>
-            <w:r>
-              <w:rPr>
-                <w:rFonts w:ascii="Arial" w:hAnsi="Arial" w:cs="Arial"/>
-                <w:sz w:val="24"/>
-                <w:szCs w:val="24"/>
-              </w:rPr>
-              <w:t>;</w:t>
+              <w:t>Output Rancangan Kegiatan Terhadap Pemecahan Isu;</w:t>
             </w:r>
           </w:p>
         </w:tc>
@@ -1511,59 +1105,13 @@
                 <w:szCs w:val="24"/>
               </w:rPr>
             </w:pPr>
-            <w:proofErr w:type="spellStart"/>
-            <w:r>
-              <w:rPr>
-                <w:rFonts w:ascii="Arial" w:hAnsi="Arial" w:cs="Arial"/>
-                <w:sz w:val="24"/>
-                <w:szCs w:val="24"/>
-              </w:rPr>
-              <w:t>Keterkaitan</w:t>
-            </w:r>
-            <w:proofErr w:type="spellEnd"/>
-            <w:r>
-              <w:rPr>
-                <w:rFonts w:ascii="Arial" w:hAnsi="Arial" w:cs="Arial"/>
-                <w:sz w:val="24"/>
-                <w:szCs w:val="24"/>
-              </w:rPr>
-              <w:t xml:space="preserve"> </w:t>
-            </w:r>
-            <w:proofErr w:type="spellStart"/>
-            <w:r>
-              <w:rPr>
-                <w:rFonts w:ascii="Arial" w:hAnsi="Arial" w:cs="Arial"/>
-                <w:sz w:val="24"/>
-                <w:szCs w:val="24"/>
-              </w:rPr>
-              <w:t>Substansi</w:t>
-            </w:r>
-            <w:proofErr w:type="spellEnd"/>
-            <w:r>
-              <w:rPr>
-                <w:rFonts w:ascii="Arial" w:hAnsi="Arial" w:cs="Arial"/>
-                <w:sz w:val="24"/>
-                <w:szCs w:val="24"/>
-              </w:rPr>
-              <w:t xml:space="preserve"> Mata </w:t>
-            </w:r>
-            <w:proofErr w:type="spellStart"/>
-            <w:r>
-              <w:rPr>
-                <w:rFonts w:ascii="Arial" w:hAnsi="Arial" w:cs="Arial"/>
-                <w:sz w:val="24"/>
-                <w:szCs w:val="24"/>
-              </w:rPr>
-              <w:t>pelatihan</w:t>
-            </w:r>
-            <w:proofErr w:type="spellEnd"/>
-            <w:r>
-              <w:rPr>
-                <w:rFonts w:ascii="Arial" w:hAnsi="Arial" w:cs="Arial"/>
-                <w:sz w:val="24"/>
-                <w:szCs w:val="24"/>
-              </w:rPr>
-              <w:t>;</w:t>
+            <w:r>
+              <w:rPr>
+                <w:rFonts w:ascii="Arial" w:hAnsi="Arial" w:cs="Arial"/>
+                <w:sz w:val="24"/>
+                <w:szCs w:val="24"/>
+              </w:rPr>
+              <w:t>Keterkaitan Substansi Mata pelatihan;</w:t>
             </w:r>
           </w:p>
         </w:tc>
@@ -1683,41 +1231,13 @@
                 <w:lang w:val="sv-SE"/>
               </w:rPr>
             </w:pPr>
-            <w:proofErr w:type="spellStart"/>
-            <w:r>
-              <w:rPr>
-                <w:rFonts w:ascii="Arial" w:hAnsi="Arial" w:cs="Arial"/>
-                <w:sz w:val="24"/>
-                <w:szCs w:val="24"/>
-              </w:rPr>
-              <w:t>Penguatan</w:t>
-            </w:r>
-            <w:proofErr w:type="spellEnd"/>
-            <w:r>
-              <w:rPr>
-                <w:rFonts w:ascii="Arial" w:hAnsi="Arial" w:cs="Arial"/>
-                <w:sz w:val="24"/>
-                <w:szCs w:val="24"/>
-              </w:rPr>
-              <w:t xml:space="preserve"> Nilai </w:t>
-            </w:r>
-            <w:proofErr w:type="spellStart"/>
-            <w:r>
-              <w:rPr>
-                <w:rFonts w:ascii="Arial" w:hAnsi="Arial" w:cs="Arial"/>
-                <w:sz w:val="24"/>
-                <w:szCs w:val="24"/>
-              </w:rPr>
-              <w:t>Organisasi</w:t>
-            </w:r>
-            <w:proofErr w:type="spellEnd"/>
-            <w:r>
-              <w:rPr>
-                <w:rFonts w:ascii="Arial" w:hAnsi="Arial" w:cs="Arial"/>
-                <w:sz w:val="24"/>
-                <w:szCs w:val="24"/>
-              </w:rPr>
-              <w:t>;</w:t>
+            <w:r>
+              <w:rPr>
+                <w:rFonts w:ascii="Arial" w:hAnsi="Arial" w:cs="Arial"/>
+                <w:sz w:val="24"/>
+                <w:szCs w:val="24"/>
+              </w:rPr>
+              <w:t>Penguatan Nilai Organisasi;</w:t>
             </w:r>
           </w:p>
         </w:tc>
@@ -1864,34 +1384,14 @@
                 <w:szCs w:val="24"/>
               </w:rPr>
             </w:pPr>
-            <w:proofErr w:type="spellStart"/>
-            <w:r>
-              <w:rPr>
-                <w:rFonts w:ascii="Arial" w:hAnsi="Arial" w:cs="Arial"/>
-                <w:sz w:val="24"/>
-                <w:szCs w:val="24"/>
-              </w:rPr>
-              <w:t>Penyelesaian</w:t>
-            </w:r>
-            <w:proofErr w:type="spellEnd"/>
-            <w:r>
-              <w:rPr>
-                <w:rFonts w:ascii="Arial" w:hAnsi="Arial" w:cs="Arial"/>
-                <w:sz w:val="24"/>
-                <w:szCs w:val="24"/>
-              </w:rPr>
-              <w:t xml:space="preserve"> </w:t>
-            </w:r>
-            <w:proofErr w:type="spellStart"/>
-            <w:r>
-              <w:rPr>
-                <w:rFonts w:ascii="Arial" w:hAnsi="Arial" w:cs="Arial"/>
-                <w:sz w:val="24"/>
-                <w:szCs w:val="24"/>
-              </w:rPr>
-              <w:t>Kegiatan</w:t>
-            </w:r>
-            <w:proofErr w:type="spellEnd"/>
+            <w:r>
+              <w:rPr>
+                <w:rFonts w:ascii="Arial" w:hAnsi="Arial" w:cs="Arial"/>
+                <w:sz w:val="24"/>
+                <w:szCs w:val="24"/>
+              </w:rPr>
+              <w:t>Penyelesaian Kegiatan</w:t>
+            </w:r>
           </w:p>
         </w:tc>
         <w:tc>
@@ -1908,23 +1408,13 @@
                 <w:szCs w:val="24"/>
               </w:rPr>
             </w:pPr>
-            <w:proofErr w:type="spellStart"/>
-            <w:r>
-              <w:rPr>
-                <w:rFonts w:ascii="Arial" w:hAnsi="Arial" w:cs="Arial"/>
-                <w:sz w:val="24"/>
-                <w:szCs w:val="24"/>
-              </w:rPr>
-              <w:t>Catatan</w:t>
-            </w:r>
-            <w:proofErr w:type="spellEnd"/>
-            <w:r>
-              <w:rPr>
-                <w:rFonts w:ascii="Arial" w:hAnsi="Arial" w:cs="Arial"/>
-                <w:sz w:val="24"/>
-                <w:szCs w:val="24"/>
-              </w:rPr>
-              <w:t xml:space="preserve"> Mentor</w:t>
+            <w:r>
+              <w:rPr>
+                <w:rFonts w:ascii="Arial" w:hAnsi="Arial" w:cs="Arial"/>
+                <w:sz w:val="24"/>
+                <w:szCs w:val="24"/>
+              </w:rPr>
+              <w:t>Catatan Mentor</w:t>
             </w:r>
           </w:p>
         </w:tc>
@@ -1974,59 +1464,13 @@
                 <w:szCs w:val="24"/>
               </w:rPr>
             </w:pPr>
-            <w:proofErr w:type="spellStart"/>
-            <w:r>
-              <w:rPr>
-                <w:rFonts w:ascii="Arial" w:hAnsi="Arial" w:cs="Arial"/>
-                <w:sz w:val="24"/>
-                <w:szCs w:val="24"/>
-              </w:rPr>
-              <w:t>Tahapan</w:t>
-            </w:r>
-            <w:proofErr w:type="spellEnd"/>
-            <w:r>
-              <w:rPr>
-                <w:rFonts w:ascii="Arial" w:hAnsi="Arial" w:cs="Arial"/>
-                <w:sz w:val="24"/>
-                <w:szCs w:val="24"/>
-              </w:rPr>
-              <w:t xml:space="preserve"> </w:t>
-            </w:r>
-            <w:proofErr w:type="spellStart"/>
-            <w:r>
-              <w:rPr>
-                <w:rFonts w:ascii="Arial" w:hAnsi="Arial" w:cs="Arial"/>
-                <w:sz w:val="24"/>
-                <w:szCs w:val="24"/>
-              </w:rPr>
-              <w:t>Rancangan</w:t>
-            </w:r>
-            <w:proofErr w:type="spellEnd"/>
-            <w:r>
-              <w:rPr>
-                <w:rFonts w:ascii="Arial" w:hAnsi="Arial" w:cs="Arial"/>
-                <w:sz w:val="24"/>
-                <w:szCs w:val="24"/>
-              </w:rPr>
-              <w:t xml:space="preserve"> </w:t>
-            </w:r>
-            <w:proofErr w:type="spellStart"/>
-            <w:r>
-              <w:rPr>
-                <w:rFonts w:ascii="Arial" w:hAnsi="Arial" w:cs="Arial"/>
-                <w:sz w:val="24"/>
-                <w:szCs w:val="24"/>
-              </w:rPr>
-              <w:t>Kegiatan</w:t>
-            </w:r>
-            <w:proofErr w:type="spellEnd"/>
-            <w:r>
-              <w:rPr>
-                <w:rFonts w:ascii="Arial" w:hAnsi="Arial" w:cs="Arial"/>
-                <w:sz w:val="24"/>
-                <w:szCs w:val="24"/>
-              </w:rPr>
-              <w:t>;</w:t>
+            <w:r>
+              <w:rPr>
+                <w:rFonts w:ascii="Arial" w:hAnsi="Arial" w:cs="Arial"/>
+                <w:sz w:val="24"/>
+                <w:szCs w:val="24"/>
+              </w:rPr>
+              <w:t>Tahapan Rancangan Kegiatan;</w:t>
             </w:r>
           </w:p>
         </w:tc>
@@ -2087,97 +1531,7 @@
                 <w:sz w:val="24"/>
                 <w:szCs w:val="24"/>
               </w:rPr>
-              <w:t xml:space="preserve">Output </w:t>
-            </w:r>
-            <w:proofErr w:type="spellStart"/>
-            <w:r>
-              <w:rPr>
-                <w:rFonts w:ascii="Arial" w:hAnsi="Arial" w:cs="Arial"/>
-                <w:sz w:val="24"/>
-                <w:szCs w:val="24"/>
-              </w:rPr>
-              <w:t>Rancangan</w:t>
-            </w:r>
-            <w:proofErr w:type="spellEnd"/>
-            <w:r>
-              <w:rPr>
-                <w:rFonts w:ascii="Arial" w:hAnsi="Arial" w:cs="Arial"/>
-                <w:sz w:val="24"/>
-                <w:szCs w:val="24"/>
-              </w:rPr>
-              <w:t xml:space="preserve"> </w:t>
-            </w:r>
-            <w:proofErr w:type="spellStart"/>
-            <w:r>
-              <w:rPr>
-                <w:rFonts w:ascii="Arial" w:hAnsi="Arial" w:cs="Arial"/>
-                <w:sz w:val="24"/>
-                <w:szCs w:val="24"/>
-              </w:rPr>
-              <w:t>Kegiatan</w:t>
-            </w:r>
-            <w:proofErr w:type="spellEnd"/>
-            <w:r>
-              <w:rPr>
-                <w:rFonts w:ascii="Arial" w:hAnsi="Arial" w:cs="Arial"/>
-                <w:sz w:val="24"/>
-                <w:szCs w:val="24"/>
-              </w:rPr>
-              <w:t xml:space="preserve"> </w:t>
-            </w:r>
-            <w:proofErr w:type="spellStart"/>
-            <w:r>
-              <w:rPr>
-                <w:rFonts w:ascii="Arial" w:hAnsi="Arial" w:cs="Arial"/>
-                <w:sz w:val="24"/>
-                <w:szCs w:val="24"/>
-              </w:rPr>
-              <w:t>Terhadap</w:t>
-            </w:r>
-            <w:proofErr w:type="spellEnd"/>
-            <w:r>
-              <w:rPr>
-                <w:rFonts w:ascii="Arial" w:hAnsi="Arial" w:cs="Arial"/>
-                <w:sz w:val="24"/>
-                <w:szCs w:val="24"/>
-              </w:rPr>
-              <w:t xml:space="preserve"> </w:t>
-            </w:r>
-            <w:proofErr w:type="spellStart"/>
-            <w:r>
-              <w:rPr>
-                <w:rFonts w:ascii="Arial" w:hAnsi="Arial" w:cs="Arial"/>
-                <w:sz w:val="24"/>
-                <w:szCs w:val="24"/>
-              </w:rPr>
-              <w:t>Pemecahan</w:t>
-            </w:r>
-            <w:proofErr w:type="spellEnd"/>
-            <w:r>
-              <w:rPr>
-                <w:rFonts w:ascii="Arial" w:hAnsi="Arial" w:cs="Arial"/>
-                <w:sz w:val="24"/>
-                <w:szCs w:val="24"/>
-              </w:rPr>
-              <w:t xml:space="preserve"> </w:t>
-            </w:r>
-            <w:proofErr w:type="spellStart"/>
-            <w:r>
-              <w:rPr>
-                <w:rFonts w:ascii="Arial" w:hAnsi="Arial" w:cs="Arial"/>
-                <w:sz w:val="24"/>
-                <w:szCs w:val="24"/>
-              </w:rPr>
-              <w:t>Isu</w:t>
-            </w:r>
-            <w:proofErr w:type="spellEnd"/>
-            <w:r>
-              <w:rPr>
-                <w:rFonts w:ascii="Arial" w:hAnsi="Arial" w:cs="Arial"/>
-                <w:sz w:val="24"/>
-                <w:szCs w:val="24"/>
-              </w:rPr>
-              <w:t>;</w:t>
+              <w:t>Output Rancangan Kegiatan Terhadap Pemecahan Isu;</w:t>
             </w:r>
           </w:p>
         </w:tc>
@@ -2232,59 +1586,13 @@
                 <w:szCs w:val="24"/>
               </w:rPr>
             </w:pPr>
-            <w:proofErr w:type="spellStart"/>
-            <w:r>
-              <w:rPr>
-                <w:rFonts w:ascii="Arial" w:hAnsi="Arial" w:cs="Arial"/>
-                <w:sz w:val="24"/>
-                <w:szCs w:val="24"/>
-              </w:rPr>
-              <w:t>Keterkaitan</w:t>
-            </w:r>
-            <w:proofErr w:type="spellEnd"/>
-            <w:r>
-              <w:rPr>
-                <w:rFonts w:ascii="Arial" w:hAnsi="Arial" w:cs="Arial"/>
-                <w:sz w:val="24"/>
-                <w:szCs w:val="24"/>
-              </w:rPr>
-              <w:t xml:space="preserve"> </w:t>
-            </w:r>
-            <w:proofErr w:type="spellStart"/>
-            <w:r>
-              <w:rPr>
-                <w:rFonts w:ascii="Arial" w:hAnsi="Arial" w:cs="Arial"/>
-                <w:sz w:val="24"/>
-                <w:szCs w:val="24"/>
-              </w:rPr>
-              <w:t>Substansi</w:t>
-            </w:r>
-            <w:proofErr w:type="spellEnd"/>
-            <w:r>
-              <w:rPr>
-                <w:rFonts w:ascii="Arial" w:hAnsi="Arial" w:cs="Arial"/>
-                <w:sz w:val="24"/>
-                <w:szCs w:val="24"/>
-              </w:rPr>
-              <w:t xml:space="preserve"> Mata </w:t>
-            </w:r>
-            <w:proofErr w:type="spellStart"/>
-            <w:r>
-              <w:rPr>
-                <w:rFonts w:ascii="Arial" w:hAnsi="Arial" w:cs="Arial"/>
-                <w:sz w:val="24"/>
-                <w:szCs w:val="24"/>
-              </w:rPr>
-              <w:t>pelatihan</w:t>
-            </w:r>
-            <w:proofErr w:type="spellEnd"/>
-            <w:r>
-              <w:rPr>
-                <w:rFonts w:ascii="Arial" w:hAnsi="Arial" w:cs="Arial"/>
-                <w:sz w:val="24"/>
-                <w:szCs w:val="24"/>
-              </w:rPr>
-              <w:t>;</w:t>
+            <w:r>
+              <w:rPr>
+                <w:rFonts w:ascii="Arial" w:hAnsi="Arial" w:cs="Arial"/>
+                <w:sz w:val="24"/>
+                <w:szCs w:val="24"/>
+              </w:rPr>
+              <w:t>Keterkaitan Substansi Mata pelatihan;</w:t>
             </w:r>
           </w:p>
         </w:tc>
@@ -2404,41 +1712,13 @@
                 <w:lang w:val="sv-SE"/>
               </w:rPr>
             </w:pPr>
-            <w:proofErr w:type="spellStart"/>
-            <w:r>
-              <w:rPr>
-                <w:rFonts w:ascii="Arial" w:hAnsi="Arial" w:cs="Arial"/>
-                <w:sz w:val="24"/>
-                <w:szCs w:val="24"/>
-              </w:rPr>
-              <w:t>Penguatan</w:t>
-            </w:r>
-            <w:proofErr w:type="spellEnd"/>
-            <w:r>
-              <w:rPr>
-                <w:rFonts w:ascii="Arial" w:hAnsi="Arial" w:cs="Arial"/>
-                <w:sz w:val="24"/>
-                <w:szCs w:val="24"/>
-              </w:rPr>
-              <w:t xml:space="preserve"> Nilai </w:t>
-            </w:r>
-            <w:proofErr w:type="spellStart"/>
-            <w:r>
-              <w:rPr>
-                <w:rFonts w:ascii="Arial" w:hAnsi="Arial" w:cs="Arial"/>
-                <w:sz w:val="24"/>
-                <w:szCs w:val="24"/>
-              </w:rPr>
-              <w:t>Organisasi</w:t>
-            </w:r>
-            <w:proofErr w:type="spellEnd"/>
-            <w:r>
-              <w:rPr>
-                <w:rFonts w:ascii="Arial" w:hAnsi="Arial" w:cs="Arial"/>
-                <w:sz w:val="24"/>
-                <w:szCs w:val="24"/>
-              </w:rPr>
-              <w:t>;</w:t>
+            <w:r>
+              <w:rPr>
+                <w:rFonts w:ascii="Arial" w:hAnsi="Arial" w:cs="Arial"/>
+                <w:sz w:val="24"/>
+                <w:szCs w:val="24"/>
+              </w:rPr>
+              <w:t>Penguatan Nilai Organisasi;</w:t>
             </w:r>
           </w:p>
         </w:tc>
@@ -2585,34 +1865,14 @@
                 <w:szCs w:val="24"/>
               </w:rPr>
             </w:pPr>
-            <w:proofErr w:type="spellStart"/>
-            <w:r>
-              <w:rPr>
-                <w:rFonts w:ascii="Arial" w:hAnsi="Arial" w:cs="Arial"/>
-                <w:sz w:val="24"/>
-                <w:szCs w:val="24"/>
-              </w:rPr>
-              <w:t>Penyelesaian</w:t>
-            </w:r>
-            <w:proofErr w:type="spellEnd"/>
-            <w:r>
-              <w:rPr>
-                <w:rFonts w:ascii="Arial" w:hAnsi="Arial" w:cs="Arial"/>
-                <w:sz w:val="24"/>
-                <w:szCs w:val="24"/>
-              </w:rPr>
-              <w:t xml:space="preserve"> </w:t>
-            </w:r>
-            <w:proofErr w:type="spellStart"/>
-            <w:r>
-              <w:rPr>
-                <w:rFonts w:ascii="Arial" w:hAnsi="Arial" w:cs="Arial"/>
-                <w:sz w:val="24"/>
-                <w:szCs w:val="24"/>
-              </w:rPr>
-              <w:t>Kegiatan</w:t>
-            </w:r>
-            <w:proofErr w:type="spellEnd"/>
+            <w:r>
+              <w:rPr>
+                <w:rFonts w:ascii="Arial" w:hAnsi="Arial" w:cs="Arial"/>
+                <w:sz w:val="24"/>
+                <w:szCs w:val="24"/>
+              </w:rPr>
+              <w:t>Penyelesaian Kegiatan</w:t>
+            </w:r>
           </w:p>
         </w:tc>
         <w:tc>
@@ -2629,23 +1889,13 @@
                 <w:szCs w:val="24"/>
               </w:rPr>
             </w:pPr>
-            <w:proofErr w:type="spellStart"/>
-            <w:r>
-              <w:rPr>
-                <w:rFonts w:ascii="Arial" w:hAnsi="Arial" w:cs="Arial"/>
-                <w:sz w:val="24"/>
-                <w:szCs w:val="24"/>
-              </w:rPr>
-              <w:t>Catatan</w:t>
-            </w:r>
-            <w:proofErr w:type="spellEnd"/>
-            <w:r>
-              <w:rPr>
-                <w:rFonts w:ascii="Arial" w:hAnsi="Arial" w:cs="Arial"/>
-                <w:sz w:val="24"/>
-                <w:szCs w:val="24"/>
-              </w:rPr>
-              <w:t xml:space="preserve"> Mentor</w:t>
+            <w:r>
+              <w:rPr>
+                <w:rFonts w:ascii="Arial" w:hAnsi="Arial" w:cs="Arial"/>
+                <w:sz w:val="24"/>
+                <w:szCs w:val="24"/>
+              </w:rPr>
+              <w:t>Catatan Mentor</w:t>
             </w:r>
           </w:p>
         </w:tc>
@@ -2695,59 +1945,13 @@
                 <w:szCs w:val="24"/>
               </w:rPr>
             </w:pPr>
-            <w:proofErr w:type="spellStart"/>
-            <w:r>
-              <w:rPr>
-                <w:rFonts w:ascii="Arial" w:hAnsi="Arial" w:cs="Arial"/>
-                <w:sz w:val="24"/>
-                <w:szCs w:val="24"/>
-              </w:rPr>
-              <w:t>Tahapan</w:t>
-            </w:r>
-            <w:proofErr w:type="spellEnd"/>
-            <w:r>
-              <w:rPr>
-                <w:rFonts w:ascii="Arial" w:hAnsi="Arial" w:cs="Arial"/>
-                <w:sz w:val="24"/>
-                <w:szCs w:val="24"/>
-              </w:rPr>
-              <w:t xml:space="preserve"> </w:t>
-            </w:r>
-            <w:proofErr w:type="spellStart"/>
-            <w:r>
-              <w:rPr>
-                <w:rFonts w:ascii="Arial" w:hAnsi="Arial" w:cs="Arial"/>
-                <w:sz w:val="24"/>
-                <w:szCs w:val="24"/>
-              </w:rPr>
-              <w:t>Rancangan</w:t>
-            </w:r>
-            <w:proofErr w:type="spellEnd"/>
-            <w:r>
-              <w:rPr>
-                <w:rFonts w:ascii="Arial" w:hAnsi="Arial" w:cs="Arial"/>
-                <w:sz w:val="24"/>
-                <w:szCs w:val="24"/>
-              </w:rPr>
-              <w:t xml:space="preserve"> </w:t>
-            </w:r>
-            <w:proofErr w:type="spellStart"/>
-            <w:r>
-              <w:rPr>
-                <w:rFonts w:ascii="Arial" w:hAnsi="Arial" w:cs="Arial"/>
-                <w:sz w:val="24"/>
-                <w:szCs w:val="24"/>
-              </w:rPr>
-              <w:t>Kegiatan</w:t>
-            </w:r>
-            <w:proofErr w:type="spellEnd"/>
-            <w:r>
-              <w:rPr>
-                <w:rFonts w:ascii="Arial" w:hAnsi="Arial" w:cs="Arial"/>
-                <w:sz w:val="24"/>
-                <w:szCs w:val="24"/>
-              </w:rPr>
-              <w:t>;</w:t>
+            <w:r>
+              <w:rPr>
+                <w:rFonts w:ascii="Arial" w:hAnsi="Arial" w:cs="Arial"/>
+                <w:sz w:val="24"/>
+                <w:szCs w:val="24"/>
+              </w:rPr>
+              <w:t>Tahapan Rancangan Kegiatan;</w:t>
             </w:r>
           </w:p>
         </w:tc>
@@ -2808,97 +2012,7 @@
                 <w:sz w:val="24"/>
                 <w:szCs w:val="24"/>
               </w:rPr>
-              <w:t xml:space="preserve">Output </w:t>
-            </w:r>
-            <w:proofErr w:type="spellStart"/>
-            <w:r>
-              <w:rPr>
-                <w:rFonts w:ascii="Arial" w:hAnsi="Arial" w:cs="Arial"/>
-                <w:sz w:val="24"/>
-                <w:szCs w:val="24"/>
-              </w:rPr>
-              <w:t>Rancangan</w:t>
-            </w:r>
-            <w:proofErr w:type="spellEnd"/>
-            <w:r>
-              <w:rPr>
-                <w:rFonts w:ascii="Arial" w:hAnsi="Arial" w:cs="Arial"/>
-                <w:sz w:val="24"/>
-                <w:szCs w:val="24"/>
-              </w:rPr>
-              <w:t xml:space="preserve"> </w:t>
-            </w:r>
-            <w:proofErr w:type="spellStart"/>
-            <w:r>
-              <w:rPr>
-                <w:rFonts w:ascii="Arial" w:hAnsi="Arial" w:cs="Arial"/>
-                <w:sz w:val="24"/>
-                <w:szCs w:val="24"/>
-              </w:rPr>
-              <w:t>Kegiatan</w:t>
-            </w:r>
-            <w:proofErr w:type="spellEnd"/>
-            <w:r>
-              <w:rPr>
-                <w:rFonts w:ascii="Arial" w:hAnsi="Arial" w:cs="Arial"/>
-                <w:sz w:val="24"/>
-                <w:szCs w:val="24"/>
-              </w:rPr>
-              <w:t xml:space="preserve"> </w:t>
-            </w:r>
-            <w:proofErr w:type="spellStart"/>
-            <w:r>
-              <w:rPr>
-                <w:rFonts w:ascii="Arial" w:hAnsi="Arial" w:cs="Arial"/>
-                <w:sz w:val="24"/>
-                <w:szCs w:val="24"/>
-              </w:rPr>
-              <w:t>Terhadap</w:t>
-            </w:r>
-            <w:proofErr w:type="spellEnd"/>
-            <w:r>
-              <w:rPr>
-                <w:rFonts w:ascii="Arial" w:hAnsi="Arial" w:cs="Arial"/>
-                <w:sz w:val="24"/>
-                <w:szCs w:val="24"/>
-              </w:rPr>
-              <w:t xml:space="preserve"> </w:t>
-            </w:r>
-            <w:proofErr w:type="spellStart"/>
-            <w:r>
-              <w:rPr>
-                <w:rFonts w:ascii="Arial" w:hAnsi="Arial" w:cs="Arial"/>
-                <w:sz w:val="24"/>
-                <w:szCs w:val="24"/>
-              </w:rPr>
-              <w:t>Pemecahan</w:t>
-            </w:r>
-            <w:proofErr w:type="spellEnd"/>
-            <w:r>
-              <w:rPr>
-                <w:rFonts w:ascii="Arial" w:hAnsi="Arial" w:cs="Arial"/>
-                <w:sz w:val="24"/>
-                <w:szCs w:val="24"/>
-              </w:rPr>
-              <w:t xml:space="preserve"> </w:t>
-            </w:r>
-            <w:proofErr w:type="spellStart"/>
-            <w:r>
-              <w:rPr>
-                <w:rFonts w:ascii="Arial" w:hAnsi="Arial" w:cs="Arial"/>
-                <w:sz w:val="24"/>
-                <w:szCs w:val="24"/>
-              </w:rPr>
-              <w:t>Isu</w:t>
-            </w:r>
-            <w:proofErr w:type="spellEnd"/>
-            <w:r>
-              <w:rPr>
-                <w:rFonts w:ascii="Arial" w:hAnsi="Arial" w:cs="Arial"/>
-                <w:sz w:val="24"/>
-                <w:szCs w:val="24"/>
-              </w:rPr>
-              <w:t>;</w:t>
+              <w:t>Output Rancangan Kegiatan Terhadap Pemecahan Isu;</w:t>
             </w:r>
           </w:p>
         </w:tc>
@@ -2953,59 +2067,13 @@
                 <w:szCs w:val="24"/>
               </w:rPr>
             </w:pPr>
-            <w:proofErr w:type="spellStart"/>
-            <w:r>
-              <w:rPr>
-                <w:rFonts w:ascii="Arial" w:hAnsi="Arial" w:cs="Arial"/>
-                <w:sz w:val="24"/>
-                <w:szCs w:val="24"/>
-              </w:rPr>
-              <w:t>Keterkaitan</w:t>
-            </w:r>
-            <w:proofErr w:type="spellEnd"/>
-            <w:r>
-              <w:rPr>
-                <w:rFonts w:ascii="Arial" w:hAnsi="Arial" w:cs="Arial"/>
-                <w:sz w:val="24"/>
-                <w:szCs w:val="24"/>
-              </w:rPr>
-              <w:t xml:space="preserve"> </w:t>
-            </w:r>
-            <w:proofErr w:type="spellStart"/>
-            <w:r>
-              <w:rPr>
-                <w:rFonts w:ascii="Arial" w:hAnsi="Arial" w:cs="Arial"/>
-                <w:sz w:val="24"/>
-                <w:szCs w:val="24"/>
-              </w:rPr>
-              <w:t>Substansi</w:t>
-            </w:r>
-            <w:proofErr w:type="spellEnd"/>
-            <w:r>
-              <w:rPr>
-                <w:rFonts w:ascii="Arial" w:hAnsi="Arial" w:cs="Arial"/>
-                <w:sz w:val="24"/>
-                <w:szCs w:val="24"/>
-              </w:rPr>
-              <w:t xml:space="preserve"> Mata </w:t>
-            </w:r>
-            <w:proofErr w:type="spellStart"/>
-            <w:r>
-              <w:rPr>
-                <w:rFonts w:ascii="Arial" w:hAnsi="Arial" w:cs="Arial"/>
-                <w:sz w:val="24"/>
-                <w:szCs w:val="24"/>
-              </w:rPr>
-              <w:t>pelatihan</w:t>
-            </w:r>
-            <w:proofErr w:type="spellEnd"/>
-            <w:r>
-              <w:rPr>
-                <w:rFonts w:ascii="Arial" w:hAnsi="Arial" w:cs="Arial"/>
-                <w:sz w:val="24"/>
-                <w:szCs w:val="24"/>
-              </w:rPr>
-              <w:t>;</w:t>
+            <w:r>
+              <w:rPr>
+                <w:rFonts w:ascii="Arial" w:hAnsi="Arial" w:cs="Arial"/>
+                <w:sz w:val="24"/>
+                <w:szCs w:val="24"/>
+              </w:rPr>
+              <w:t>Keterkaitan Substansi Mata pelatihan;</w:t>
             </w:r>
           </w:p>
         </w:tc>
@@ -3125,41 +2193,13 @@
                 <w:lang w:val="sv-SE"/>
               </w:rPr>
             </w:pPr>
-            <w:proofErr w:type="spellStart"/>
-            <w:r>
-              <w:rPr>
-                <w:rFonts w:ascii="Arial" w:hAnsi="Arial" w:cs="Arial"/>
-                <w:sz w:val="24"/>
-                <w:szCs w:val="24"/>
-              </w:rPr>
-              <w:t>Penguatan</w:t>
-            </w:r>
-            <w:proofErr w:type="spellEnd"/>
-            <w:r>
-              <w:rPr>
-                <w:rFonts w:ascii="Arial" w:hAnsi="Arial" w:cs="Arial"/>
-                <w:sz w:val="24"/>
-                <w:szCs w:val="24"/>
-              </w:rPr>
-              <w:t xml:space="preserve"> Nilai </w:t>
-            </w:r>
-            <w:proofErr w:type="spellStart"/>
-            <w:r>
-              <w:rPr>
-                <w:rFonts w:ascii="Arial" w:hAnsi="Arial" w:cs="Arial"/>
-                <w:sz w:val="24"/>
-                <w:szCs w:val="24"/>
-              </w:rPr>
-              <w:t>Organisasi</w:t>
-            </w:r>
-            <w:proofErr w:type="spellEnd"/>
-            <w:r>
-              <w:rPr>
-                <w:rFonts w:ascii="Arial" w:hAnsi="Arial" w:cs="Arial"/>
-                <w:sz w:val="24"/>
-                <w:szCs w:val="24"/>
-              </w:rPr>
-              <w:t>;</w:t>
+            <w:r>
+              <w:rPr>
+                <w:rFonts w:ascii="Arial" w:hAnsi="Arial" w:cs="Arial"/>
+                <w:sz w:val="24"/>
+                <w:szCs w:val="24"/>
+              </w:rPr>
+              <w:t>Penguatan Nilai Organisasi;</w:t>
             </w:r>
           </w:p>
         </w:tc>
@@ -3276,54 +2316,8 @@
           <w:sz w:val="24"/>
           <w:szCs w:val="24"/>
         </w:rPr>
-        <w:t xml:space="preserve">Menyusun </w:t>
-      </w:r>
-      <w:proofErr w:type="spellStart"/>
-      <w:r>
-        <w:rPr>
-          <w:rFonts w:ascii="Arial" w:hAnsi="Arial" w:cs="Arial"/>
-          <w:sz w:val="24"/>
-          <w:szCs w:val="24"/>
-        </w:rPr>
-        <w:t>alur</w:t>
-      </w:r>
-      <w:proofErr w:type="spellEnd"/>
-      <w:r>
-        <w:rPr>
-          <w:rFonts w:ascii="Arial" w:hAnsi="Arial" w:cs="Arial"/>
-          <w:sz w:val="24"/>
-          <w:szCs w:val="24"/>
-        </w:rPr>
-        <w:t xml:space="preserve"> final </w:t>
-      </w:r>
-      <w:proofErr w:type="spellStart"/>
-      <w:r>
-        <w:rPr>
-          <w:rFonts w:ascii="Arial" w:hAnsi="Arial" w:cs="Arial"/>
-          <w:sz w:val="24"/>
-          <w:szCs w:val="24"/>
-        </w:rPr>
-        <w:t>optimalisasi</w:t>
-      </w:r>
-      <w:proofErr w:type="spellEnd"/>
-      <w:r>
-        <w:rPr>
-          <w:rFonts w:ascii="Arial" w:hAnsi="Arial" w:cs="Arial"/>
-          <w:sz w:val="24"/>
-          <w:szCs w:val="24"/>
-        </w:rPr>
-        <w:t xml:space="preserve"> arsip dokumen </w:t>
-      </w:r>
-      <w:proofErr w:type="spellStart"/>
-      <w:r>
-        <w:rPr>
-          <w:rFonts w:ascii="Arial" w:hAnsi="Arial" w:cs="Arial"/>
-          <w:sz w:val="24"/>
-          <w:szCs w:val="24"/>
-        </w:rPr>
-        <w:t>disposisi</w:t>
-      </w:r>
-      <w:proofErr w:type="spellEnd"/>
+        <w:t>Menyusun alur final optimalisasi arsip dokumen disposisi</w:t>
+      </w:r>
     </w:p>
     <w:tbl>
       <w:tblPr>
@@ -3351,34 +2345,14 @@
                 <w:szCs w:val="24"/>
               </w:rPr>
             </w:pPr>
-            <w:proofErr w:type="spellStart"/>
-            <w:r>
-              <w:rPr>
-                <w:rFonts w:ascii="Arial" w:hAnsi="Arial" w:cs="Arial"/>
-                <w:sz w:val="24"/>
-                <w:szCs w:val="24"/>
-              </w:rPr>
-              <w:t>Penyelesaian</w:t>
-            </w:r>
-            <w:proofErr w:type="spellEnd"/>
-            <w:r>
-              <w:rPr>
-                <w:rFonts w:ascii="Arial" w:hAnsi="Arial" w:cs="Arial"/>
-                <w:sz w:val="24"/>
-                <w:szCs w:val="24"/>
-              </w:rPr>
-              <w:t xml:space="preserve"> </w:t>
-            </w:r>
-            <w:proofErr w:type="spellStart"/>
-            <w:r>
-              <w:rPr>
-                <w:rFonts w:ascii="Arial" w:hAnsi="Arial" w:cs="Arial"/>
-                <w:sz w:val="24"/>
-                <w:szCs w:val="24"/>
-              </w:rPr>
-              <w:t>Kegiatan</w:t>
-            </w:r>
-            <w:proofErr w:type="spellEnd"/>
+            <w:r>
+              <w:rPr>
+                <w:rFonts w:ascii="Arial" w:hAnsi="Arial" w:cs="Arial"/>
+                <w:sz w:val="24"/>
+                <w:szCs w:val="24"/>
+              </w:rPr>
+              <w:t>Penyelesaian Kegiatan</w:t>
+            </w:r>
           </w:p>
         </w:tc>
         <w:tc>
@@ -3395,23 +2369,13 @@
                 <w:szCs w:val="24"/>
               </w:rPr>
             </w:pPr>
-            <w:proofErr w:type="spellStart"/>
-            <w:r>
-              <w:rPr>
-                <w:rFonts w:ascii="Arial" w:hAnsi="Arial" w:cs="Arial"/>
-                <w:sz w:val="24"/>
-                <w:szCs w:val="24"/>
-              </w:rPr>
-              <w:t>Catatan</w:t>
-            </w:r>
-            <w:proofErr w:type="spellEnd"/>
-            <w:r>
-              <w:rPr>
-                <w:rFonts w:ascii="Arial" w:hAnsi="Arial" w:cs="Arial"/>
-                <w:sz w:val="24"/>
-                <w:szCs w:val="24"/>
-              </w:rPr>
-              <w:t xml:space="preserve"> Mentor</w:t>
+            <w:r>
+              <w:rPr>
+                <w:rFonts w:ascii="Arial" w:hAnsi="Arial" w:cs="Arial"/>
+                <w:sz w:val="24"/>
+                <w:szCs w:val="24"/>
+              </w:rPr>
+              <w:t>Catatan Mentor</w:t>
             </w:r>
           </w:p>
         </w:tc>
@@ -3461,59 +2425,13 @@
                 <w:szCs w:val="24"/>
               </w:rPr>
             </w:pPr>
-            <w:proofErr w:type="spellStart"/>
-            <w:r>
-              <w:rPr>
-                <w:rFonts w:ascii="Arial" w:hAnsi="Arial" w:cs="Arial"/>
-                <w:sz w:val="24"/>
-                <w:szCs w:val="24"/>
-              </w:rPr>
-              <w:t>Tahapan</w:t>
-            </w:r>
-            <w:proofErr w:type="spellEnd"/>
-            <w:r>
-              <w:rPr>
-                <w:rFonts w:ascii="Arial" w:hAnsi="Arial" w:cs="Arial"/>
-                <w:sz w:val="24"/>
-                <w:szCs w:val="24"/>
-              </w:rPr>
-              <w:t xml:space="preserve"> </w:t>
-            </w:r>
-            <w:proofErr w:type="spellStart"/>
-            <w:r>
-              <w:rPr>
-                <w:rFonts w:ascii="Arial" w:hAnsi="Arial" w:cs="Arial"/>
-                <w:sz w:val="24"/>
-                <w:szCs w:val="24"/>
-              </w:rPr>
-              <w:t>Rancangan</w:t>
-            </w:r>
-            <w:proofErr w:type="spellEnd"/>
-            <w:r>
-              <w:rPr>
-                <w:rFonts w:ascii="Arial" w:hAnsi="Arial" w:cs="Arial"/>
-                <w:sz w:val="24"/>
-                <w:szCs w:val="24"/>
-              </w:rPr>
-              <w:t xml:space="preserve"> </w:t>
-            </w:r>
-            <w:proofErr w:type="spellStart"/>
-            <w:r>
-              <w:rPr>
-                <w:rFonts w:ascii="Arial" w:hAnsi="Arial" w:cs="Arial"/>
-                <w:sz w:val="24"/>
-                <w:szCs w:val="24"/>
-              </w:rPr>
-              <w:t>Kegiatan</w:t>
-            </w:r>
-            <w:proofErr w:type="spellEnd"/>
-            <w:r>
-              <w:rPr>
-                <w:rFonts w:ascii="Arial" w:hAnsi="Arial" w:cs="Arial"/>
-                <w:sz w:val="24"/>
-                <w:szCs w:val="24"/>
-              </w:rPr>
-              <w:t>;</w:t>
+            <w:r>
+              <w:rPr>
+                <w:rFonts w:ascii="Arial" w:hAnsi="Arial" w:cs="Arial"/>
+                <w:sz w:val="24"/>
+                <w:szCs w:val="24"/>
+              </w:rPr>
+              <w:t>Tahapan Rancangan Kegiatan;</w:t>
             </w:r>
           </w:p>
         </w:tc>
@@ -3574,97 +2492,7 @@
                 <w:sz w:val="24"/>
                 <w:szCs w:val="24"/>
               </w:rPr>
-              <w:t xml:space="preserve">Output </w:t>
-            </w:r>
-            <w:proofErr w:type="spellStart"/>
-            <w:r>
-              <w:rPr>
-                <w:rFonts w:ascii="Arial" w:hAnsi="Arial" w:cs="Arial"/>
-                <w:sz w:val="24"/>
-                <w:szCs w:val="24"/>
-              </w:rPr>
-              <w:t>Rancangan</w:t>
-            </w:r>
-            <w:proofErr w:type="spellEnd"/>
-            <w:r>
-              <w:rPr>
-                <w:rFonts w:ascii="Arial" w:hAnsi="Arial" w:cs="Arial"/>
-                <w:sz w:val="24"/>
-                <w:szCs w:val="24"/>
-              </w:rPr>
-              <w:t xml:space="preserve"> </w:t>
-            </w:r>
-            <w:proofErr w:type="spellStart"/>
-            <w:r>
-              <w:rPr>
-                <w:rFonts w:ascii="Arial" w:hAnsi="Arial" w:cs="Arial"/>
-                <w:sz w:val="24"/>
-                <w:szCs w:val="24"/>
-              </w:rPr>
-              <w:t>Kegiatan</w:t>
-            </w:r>
-            <w:proofErr w:type="spellEnd"/>
-            <w:r>
-              <w:rPr>
-                <w:rFonts w:ascii="Arial" w:hAnsi="Arial" w:cs="Arial"/>
-                <w:sz w:val="24"/>
-                <w:szCs w:val="24"/>
-              </w:rPr>
-              <w:t xml:space="preserve"> </w:t>
-            </w:r>
-            <w:proofErr w:type="spellStart"/>
-            <w:r>
-              <w:rPr>
-                <w:rFonts w:ascii="Arial" w:hAnsi="Arial" w:cs="Arial"/>
-                <w:sz w:val="24"/>
-                <w:szCs w:val="24"/>
-              </w:rPr>
-              <w:t>Terhadap</w:t>
-            </w:r>
-            <w:proofErr w:type="spellEnd"/>
-            <w:r>
-              <w:rPr>
-                <w:rFonts w:ascii="Arial" w:hAnsi="Arial" w:cs="Arial"/>
-                <w:sz w:val="24"/>
-                <w:szCs w:val="24"/>
-              </w:rPr>
-              <w:t xml:space="preserve"> </w:t>
-            </w:r>
-            <w:proofErr w:type="spellStart"/>
-            <w:r>
-              <w:rPr>
-                <w:rFonts w:ascii="Arial" w:hAnsi="Arial" w:cs="Arial"/>
-                <w:sz w:val="24"/>
-                <w:szCs w:val="24"/>
-              </w:rPr>
-              <w:t>Pemecahan</w:t>
-            </w:r>
-            <w:proofErr w:type="spellEnd"/>
-            <w:r>
-              <w:rPr>
-                <w:rFonts w:ascii="Arial" w:hAnsi="Arial" w:cs="Arial"/>
-                <w:sz w:val="24"/>
-                <w:szCs w:val="24"/>
-              </w:rPr>
-              <w:t xml:space="preserve"> </w:t>
-            </w:r>
-            <w:proofErr w:type="spellStart"/>
-            <w:r>
-              <w:rPr>
-                <w:rFonts w:ascii="Arial" w:hAnsi="Arial" w:cs="Arial"/>
-                <w:sz w:val="24"/>
-                <w:szCs w:val="24"/>
-              </w:rPr>
-              <w:t>Isu</w:t>
-            </w:r>
-            <w:proofErr w:type="spellEnd"/>
-            <w:r>
-              <w:rPr>
-                <w:rFonts w:ascii="Arial" w:hAnsi="Arial" w:cs="Arial"/>
-                <w:sz w:val="24"/>
-                <w:szCs w:val="24"/>
-              </w:rPr>
-              <w:t>;</w:t>
+              <w:t>Output Rancangan Kegiatan Terhadap Pemecahan Isu;</w:t>
             </w:r>
           </w:p>
         </w:tc>
@@ -3719,59 +2547,13 @@
                 <w:szCs w:val="24"/>
               </w:rPr>
             </w:pPr>
-            <w:proofErr w:type="spellStart"/>
-            <w:r>
-              <w:rPr>
-                <w:rFonts w:ascii="Arial" w:hAnsi="Arial" w:cs="Arial"/>
-                <w:sz w:val="24"/>
-                <w:szCs w:val="24"/>
-              </w:rPr>
-              <w:t>Keterkaitan</w:t>
-            </w:r>
-            <w:proofErr w:type="spellEnd"/>
-            <w:r>
-              <w:rPr>
-                <w:rFonts w:ascii="Arial" w:hAnsi="Arial" w:cs="Arial"/>
-                <w:sz w:val="24"/>
-                <w:szCs w:val="24"/>
-              </w:rPr>
-              <w:t xml:space="preserve"> </w:t>
-            </w:r>
-            <w:proofErr w:type="spellStart"/>
-            <w:r>
-              <w:rPr>
-                <w:rFonts w:ascii="Arial" w:hAnsi="Arial" w:cs="Arial"/>
-                <w:sz w:val="24"/>
-                <w:szCs w:val="24"/>
-              </w:rPr>
-              <w:t>Substansi</w:t>
-            </w:r>
-            <w:proofErr w:type="spellEnd"/>
-            <w:r>
-              <w:rPr>
-                <w:rFonts w:ascii="Arial" w:hAnsi="Arial" w:cs="Arial"/>
-                <w:sz w:val="24"/>
-                <w:szCs w:val="24"/>
-              </w:rPr>
-              <w:t xml:space="preserve"> Mata </w:t>
-            </w:r>
-            <w:proofErr w:type="spellStart"/>
-            <w:r>
-              <w:rPr>
-                <w:rFonts w:ascii="Arial" w:hAnsi="Arial" w:cs="Arial"/>
-                <w:sz w:val="24"/>
-                <w:szCs w:val="24"/>
-              </w:rPr>
-              <w:t>pelatihan</w:t>
-            </w:r>
-            <w:proofErr w:type="spellEnd"/>
-            <w:r>
-              <w:rPr>
-                <w:rFonts w:ascii="Arial" w:hAnsi="Arial" w:cs="Arial"/>
-                <w:sz w:val="24"/>
-                <w:szCs w:val="24"/>
-              </w:rPr>
-              <w:t>;</w:t>
+            <w:r>
+              <w:rPr>
+                <w:rFonts w:ascii="Arial" w:hAnsi="Arial" w:cs="Arial"/>
+                <w:sz w:val="24"/>
+                <w:szCs w:val="24"/>
+              </w:rPr>
+              <w:t>Keterkaitan Substansi Mata pelatihan;</w:t>
             </w:r>
           </w:p>
         </w:tc>
@@ -3891,41 +2673,13 @@
                 <w:lang w:val="sv-SE"/>
               </w:rPr>
             </w:pPr>
-            <w:proofErr w:type="spellStart"/>
-            <w:r>
-              <w:rPr>
-                <w:rFonts w:ascii="Arial" w:hAnsi="Arial" w:cs="Arial"/>
-                <w:sz w:val="24"/>
-                <w:szCs w:val="24"/>
-              </w:rPr>
-              <w:t>Penguatan</w:t>
-            </w:r>
-            <w:proofErr w:type="spellEnd"/>
-            <w:r>
-              <w:rPr>
-                <w:rFonts w:ascii="Arial" w:hAnsi="Arial" w:cs="Arial"/>
-                <w:sz w:val="24"/>
-                <w:szCs w:val="24"/>
-              </w:rPr>
-              <w:t xml:space="preserve"> Nilai </w:t>
-            </w:r>
-            <w:proofErr w:type="spellStart"/>
-            <w:r>
-              <w:rPr>
-                <w:rFonts w:ascii="Arial" w:hAnsi="Arial" w:cs="Arial"/>
-                <w:sz w:val="24"/>
-                <w:szCs w:val="24"/>
-              </w:rPr>
-              <w:t>Organisasi</w:t>
-            </w:r>
-            <w:proofErr w:type="spellEnd"/>
-            <w:r>
-              <w:rPr>
-                <w:rFonts w:ascii="Arial" w:hAnsi="Arial" w:cs="Arial"/>
-                <w:sz w:val="24"/>
-                <w:szCs w:val="24"/>
-              </w:rPr>
-              <w:t>;</w:t>
+            <w:r>
+              <w:rPr>
+                <w:rFonts w:ascii="Arial" w:hAnsi="Arial" w:cs="Arial"/>
+                <w:sz w:val="24"/>
+                <w:szCs w:val="24"/>
+              </w:rPr>
+              <w:t>Penguatan Nilai Organisasi;</w:t>
             </w:r>
           </w:p>
         </w:tc>
@@ -4316,7 +3070,6 @@
   <w:style w:type="character" w:default="1" w:styleId="DefaultParagraphFont">
     <w:name w:val="Default Paragraph Font"/>
     <w:uiPriority w:val="1"/>
-    <w:semiHidden/>
     <w:unhideWhenUsed/>
   </w:style>
   <w:style w:type="table" w:default="1" w:styleId="TableNormal">

</xml_diff>